<commit_message>
doc changes for copilot UI feature
</commit_message>
<xml_diff>
--- a/docs/Manufacturing Impact Copilot.docx
+++ b/docs/Manufacturing Impact Copilot.docx
@@ -47,7 +47,7 @@
     <w:p>
       <w:r>
         <w:pict w14:anchorId="0D25D4E4">
-          <v:rect id="_x0000_i1026" style="width:0;height:1.5pt" o:hralign="center" o:hrstd="t" o:hr="t"/>
+          <v:rect id="_x0000_i1027" style="width:0;height:1.5pt" o:hralign="center" o:hrstd="t" o:hr="t"/>
         </w:pict>
       </w:r>
     </w:p>
@@ -175,7 +175,7 @@
     <w:p>
       <w:r>
         <w:pict w14:anchorId="7F64E4B3">
-          <v:rect id="_x0000_i1027" style="width:0;height:1.5pt" o:hralign="center" o:hrstd="t" o:hr="t"/>
+          <v:rect id="_x0000_i1028" style="width:0;height:1.5pt" o:hralign="center" o:hrstd="t" o:hr="t"/>
         </w:pict>
       </w:r>
     </w:p>
@@ -294,7 +294,7 @@
       <w:r>
         <w:lastRenderedPageBreak/>
         <w:pict w14:anchorId="5CA697DE">
-          <v:rect id="_x0000_i1028" style="width:0;height:1.5pt" o:hralign="center" o:hrstd="t" o:hr="t"/>
+          <v:rect id="_x0000_i1029" style="width:0;height:1.5pt" o:hralign="center" o:hrstd="t" o:hr="t"/>
         </w:pict>
       </w:r>
     </w:p>
@@ -561,7 +561,37 @@
               </w:rPr>
             </w:pPr>
             <w:r>
-              <w:t>X-API-Key Header</w:t>
+              <w:t xml:space="preserve">X-API-Key </w:t>
+            </w:r>
+            <w:proofErr w:type="gramStart"/>
+            <w:r>
+              <w:t>Header</w:t>
+            </w:r>
+            <w:r>
+              <w:t>(</w:t>
+            </w:r>
+            <w:proofErr w:type="spellStart"/>
+            <w:proofErr w:type="gramEnd"/>
+            <w:r>
+              <w:t>eg</w:t>
+            </w:r>
+            <w:proofErr w:type="spellEnd"/>
+            <w:r>
+              <w:t xml:space="preserve">: </w:t>
+            </w:r>
+            <w:r>
+              <w:t>dev-</w:t>
+            </w:r>
+            <w:proofErr w:type="spellStart"/>
+            <w:r>
+              <w:t>api</w:t>
+            </w:r>
+            <w:proofErr w:type="spellEnd"/>
+            <w:r>
+              <w:t>-key</w:t>
+            </w:r>
+            <w:r>
+              <w:t>)</w:t>
             </w:r>
           </w:p>
         </w:tc>
@@ -666,7 +696,7 @@
     <w:p>
       <w:r>
         <w:pict w14:anchorId="7E1D0EC3">
-          <v:rect id="_x0000_i1029" style="width:0;height:1.5pt" o:hralign="center" o:hrstd="t" o:hr="t"/>
+          <v:rect id="_x0000_i1030" style="width:0;height:1.5pt" o:hralign="center" o:hrstd="t" o:hr="t"/>
         </w:pict>
       </w:r>
     </w:p>
@@ -787,7 +817,7 @@
     <w:p>
       <w:r>
         <w:pict w14:anchorId="3BCC5D5B">
-          <v:rect id="_x0000_i1030" style="width:0;height:1.5pt" o:hralign="center" o:hrstd="t" o:hr="t"/>
+          <v:rect id="_x0000_i1031" style="width:0;height:1.5pt" o:hralign="center" o:hrstd="t" o:hr="t"/>
         </w:pict>
       </w:r>
     </w:p>
@@ -904,7 +934,7 @@
     <w:p>
       <w:r>
         <w:pict w14:anchorId="2A26321E">
-          <v:rect id="_x0000_i1031" style="width:0;height:1.5pt" o:hralign="center" o:hrstd="t" o:hr="t"/>
+          <v:rect id="_x0000_i1032" style="width:0;height:1.5pt" o:hralign="center" o:hrstd="t" o:hr="t"/>
         </w:pict>
       </w:r>
     </w:p>
@@ -1016,7 +1046,7 @@
       <w:r>
         <w:lastRenderedPageBreak/>
         <w:pict w14:anchorId="165D7C5F">
-          <v:rect id="_x0000_i1032" style="width:0;height:1.5pt" o:hralign="center" o:hrstd="t" o:hr="t"/>
+          <v:rect id="_x0000_i1033" style="width:0;height:1.5pt" o:hralign="center" o:hrstd="t" o:hr="t"/>
         </w:pict>
       </w:r>
     </w:p>
@@ -1127,7 +1157,7 @@
     <w:p>
       <w:r>
         <w:pict w14:anchorId="1B790954">
-          <v:rect id="_x0000_i1033" style="width:0;height:1.5pt" o:hralign="center" o:hrstd="t" o:hr="t"/>
+          <v:rect id="_x0000_i1034" style="width:0;height:1.5pt" o:hralign="center" o:hrstd="t" o:hr="t"/>
         </w:pict>
       </w:r>
     </w:p>
@@ -1229,7 +1259,7 @@
     <w:p>
       <w:r>
         <w:pict w14:anchorId="0D679391">
-          <v:rect id="_x0000_i1034" style="width:0;height:1.5pt" o:hralign="center" o:bullet="t" o:hrstd="t" o:hr="t"/>
+          <v:rect id="_x0000_i1035" style="width:0;height:1.5pt" o:hralign="center" o:bullet="t" o:hrstd="t" o:hr="t"/>
         </w:pict>
       </w:r>
     </w:p>
@@ -1505,7 +1535,7 @@
           <w:lang w:val="en-IN"/>
         </w:rPr>
         <w:pict w14:anchorId="765ADBA9">
-          <v:rect id="_x0000_i1035" style="width:0;height:1.5pt" o:hralign="center" o:hrstd="t" o:hr="t" fillcolor="#a0a0a0" stroked="f"/>
+          <v:rect id="_x0000_i1036" style="width:0;height:1.5pt" o:hralign="center" o:hrstd="t" o:hr="t" fillcolor="#a0a0a0" stroked="f"/>
         </w:pict>
       </w:r>
     </w:p>
@@ -2013,7 +2043,7 @@
           <w:lang w:val="en-IN"/>
         </w:rPr>
         <w:pict w14:anchorId="0C89AECD">
-          <v:rect id="_x0000_i1036" style="width:0;height:1.5pt" o:hralign="center" o:hrstd="t" o:hr="t" fillcolor="#a0a0a0" stroked="f"/>
+          <v:rect id="_x0000_i1037" style="width:0;height:1.5pt" o:hralign="center" o:hrstd="t" o:hr="t" fillcolor="#a0a0a0" stroked="f"/>
         </w:pict>
       </w:r>
     </w:p>
@@ -2149,7 +2179,7 @@
           <w:lang w:val="en-IN"/>
         </w:rPr>
         <w:pict w14:anchorId="1903A207">
-          <v:rect id="_x0000_i1037" style="width:0;height:1.5pt" o:hralign="center" o:hrstd="t" o:hr="t" fillcolor="#a0a0a0" stroked="f"/>
+          <v:rect id="_x0000_i1038" style="width:0;height:1.5pt" o:hralign="center" o:hrstd="t" o:hr="t" fillcolor="#a0a0a0" stroked="f"/>
         </w:pict>
       </w:r>
     </w:p>
@@ -2314,7 +2344,7 @@
     <w:p>
       <w:r>
         <w:pict w14:anchorId="7133345E">
-          <v:rect id="_x0000_i1038" style="width:0;height:1.5pt" o:hralign="center" o:hrstd="t" o:hr="t"/>
+          <v:rect id="_x0000_i1039" style="width:0;height:1.5pt" o:hralign="center" o:hrstd="t" o:hr="t"/>
         </w:pict>
       </w:r>
     </w:p>
@@ -2393,7 +2423,7 @@
     <w:p>
       <w:r>
         <w:pict w14:anchorId="5994D00E">
-          <v:rect id="_x0000_i1039" style="width:0;height:1.5pt" o:hralign="center" o:hrstd="t" o:hr="t"/>
+          <v:rect id="_x0000_i1040" style="width:0;height:1.5pt" o:hralign="center" o:hrstd="t" o:hr="t"/>
         </w:pict>
       </w:r>
     </w:p>
@@ -2852,7 +2882,7 @@
     <w:p>
       <w:r>
         <w:pict w14:anchorId="3CFE93A2">
-          <v:rect id="_x0000_i1040" style="width:0;height:1.5pt" o:hralign="center" o:hrstd="t" o:hr="t"/>
+          <v:rect id="_x0000_i1041" style="width:0;height:1.5pt" o:hralign="center" o:hrstd="t" o:hr="t"/>
         </w:pict>
       </w:r>
     </w:p>
@@ -2953,7 +2983,7 @@
       <w:r>
         <w:lastRenderedPageBreak/>
         <w:pict w14:anchorId="0D7292EF">
-          <v:rect id="_x0000_i1041" style="width:0;height:1.5pt" o:hralign="center" o:hrstd="t" o:hr="t"/>
+          <v:rect id="_x0000_i1042" style="width:0;height:1.5pt" o:hralign="center" o:hrstd="t" o:hr="t"/>
         </w:pict>
       </w:r>
     </w:p>
@@ -3021,7 +3051,7 @@
     <w:p>
       <w:r>
         <w:pict w14:anchorId="7F7B8F92">
-          <v:rect id="_x0000_i1042" style="width:0;height:1.5pt" o:hralign="center" o:hrstd="t" o:hr="t"/>
+          <v:rect id="_x0000_i1043" style="width:0;height:1.5pt" o:hralign="center" o:hrstd="t" o:hr="t"/>
         </w:pict>
       </w:r>
     </w:p>
@@ -3106,7 +3136,7 @@
     <w:p>
       <w:r>
         <w:pict w14:anchorId="423FCF72">
-          <v:rect id="_x0000_i1043" style="width:0;height:1.5pt" o:hralign="center" o:hrstd="t" o:hr="t"/>
+          <v:rect id="_x0000_i1044" style="width:0;height:1.5pt" o:hralign="center" o:hrstd="t" o:hr="t"/>
         </w:pict>
       </w:r>
     </w:p>
@@ -3201,7 +3231,7 @@
       <w:r>
         <w:lastRenderedPageBreak/>
         <w:pict w14:anchorId="2506288D">
-          <v:rect id="_x0000_i1044" style="width:0;height:1.5pt" o:hralign="center" o:hrstd="t" o:hr="t"/>
+          <v:rect id="_x0000_i1045" style="width:0;height:1.5pt" o:hralign="center" o:hrstd="t" o:hr="t"/>
         </w:pict>
       </w:r>
     </w:p>
@@ -3285,7 +3315,7 @@
     <w:p>
       <w:r>
         <w:pict w14:anchorId="784E5E6B">
-          <v:rect id="_x0000_i1045" style="width:0;height:1.5pt" o:hralign="center" o:hrstd="t" o:hr="t"/>
+          <v:rect id="_x0000_i1046" style="width:0;height:1.5pt" o:hralign="center" o:hrstd="t" o:hr="t"/>
         </w:pict>
       </w:r>
     </w:p>
@@ -3369,7 +3399,7 @@
     <w:p>
       <w:r>
         <w:pict w14:anchorId="71892DB9">
-          <v:rect id="_x0000_i1046" style="width:0;height:1.5pt" o:hralign="center" o:hrstd="t" o:hr="t"/>
+          <v:rect id="_x0000_i1047" style="width:0;height:1.5pt" o:hralign="center" o:hrstd="t" o:hr="t"/>
         </w:pict>
       </w:r>
     </w:p>
@@ -3441,7 +3471,7 @@
     <w:p>
       <w:r>
         <w:pict w14:anchorId="36ABFFFA">
-          <v:rect id="_x0000_i1047" style="width:0;height:1.5pt" o:hralign="center" o:hrstd="t" o:hr="t"/>
+          <v:rect id="_x0000_i1048" style="width:0;height:1.5pt" o:hralign="center" o:hrstd="t" o:hr="t"/>
         </w:pict>
       </w:r>
     </w:p>
@@ -3465,13 +3495,7 @@
         </w:rPr>
       </w:pPr>
       <w:r>
-        <w:t xml:space="preserve">The prompt details </w:t>
-      </w:r>
-      <w:r>
-        <w:t>are</w:t>
-      </w:r>
-      <w:r>
-        <w:t xml:space="preserve"> </w:t>
+        <w:t xml:space="preserve">The prompt details are </w:t>
       </w:r>
       <w:r>
         <w:t>embedded</w:t>
@@ -3543,7 +3567,7 @@
     <w:p>
       <w:r>
         <w:pict w14:anchorId="7F87F7B4">
-          <v:rect id="_x0000_i1048" style="width:0;height:1.5pt" o:hralign="center" o:hrstd="t" o:hr="t"/>
+          <v:rect id="_x0000_i1049" style="width:0;height:1.5pt" o:hralign="center" o:hrstd="t" o:hr="t"/>
         </w:pict>
       </w:r>
     </w:p>
@@ -3641,7 +3665,7 @@
     <w:p>
       <w:r>
         <w:pict w14:anchorId="1E36A516">
-          <v:rect id="_x0000_i1049" style="width:0;height:1.5pt" o:hralign="center" o:hrstd="t" o:hr="t"/>
+          <v:rect id="_x0000_i1050" style="width:0;height:1.5pt" o:hralign="center" o:hrstd="t" o:hr="t"/>
         </w:pict>
       </w:r>
     </w:p>
@@ -3701,10 +3725,11 @@
     <w:p>
       <w:r>
         <w:pict w14:anchorId="3167F7AA">
-          <v:rect id="_x0000_i1050" style="width:0;height:1.5pt" o:hralign="center" o:hrstd="t" o:hr="t"/>
+          <v:rect id="_x0000_i1051" style="width:0;height:1.5pt" o:hralign="center" o:bullet="t" o:hrstd="t" o:hr="t"/>
         </w:pict>
       </w:r>
     </w:p>
+    <w:p/>
     <w:p>
       <w:pPr>
         <w:pStyle w:val="Heading1"/>
@@ -3714,6 +3739,186 @@
       <w:bookmarkEnd w:id="25"/>
       <w:r>
         <w:lastRenderedPageBreak/>
+        <w:t>Copilot UI</w:t>
+      </w:r>
+    </w:p>
+    <w:p>
+      <w:pPr>
+        <w:pStyle w:val="BodyText"/>
+        <w:rPr>
+          <w:lang w:val="en-IN"/>
+        </w:rPr>
+      </w:pPr>
+      <w:r>
+        <w:rPr>
+          <w:lang w:val="en-IN"/>
+        </w:rPr>
+        <w:t>The central chat area provides a natural language interaction experience.</w:t>
+      </w:r>
+    </w:p>
+    <w:p>
+      <w:pPr>
+        <w:pStyle w:val="BodyText"/>
+        <w:rPr>
+          <w:lang w:val="en-IN"/>
+        </w:rPr>
+      </w:pPr>
+      <w:r>
+        <w:rPr>
+          <w:lang w:val="en-IN"/>
+        </w:rPr>
+        <w:t>Users can:</w:t>
+      </w:r>
+    </w:p>
+    <w:p>
+      <w:pPr>
+        <w:pStyle w:val="BodyText"/>
+        <w:numPr>
+          <w:ilvl w:val="0"/>
+          <w:numId w:val="23"/>
+        </w:numPr>
+        <w:rPr>
+          <w:lang w:val="en-IN"/>
+        </w:rPr>
+      </w:pPr>
+      <w:r>
+        <w:rPr>
+          <w:lang w:val="en-IN"/>
+        </w:rPr>
+        <w:t xml:space="preserve">Ask questions using business terminology </w:t>
+      </w:r>
+    </w:p>
+    <w:p>
+      <w:pPr>
+        <w:pStyle w:val="BodyText"/>
+        <w:numPr>
+          <w:ilvl w:val="0"/>
+          <w:numId w:val="23"/>
+        </w:numPr>
+        <w:rPr>
+          <w:lang w:val="en-IN"/>
+        </w:rPr>
+      </w:pPr>
+      <w:r>
+        <w:rPr>
+          <w:lang w:val="en-IN"/>
+        </w:rPr>
+        <w:t xml:space="preserve">Reference entities using IDs </w:t>
+      </w:r>
+    </w:p>
+    <w:p>
+      <w:pPr>
+        <w:pStyle w:val="BodyText"/>
+        <w:numPr>
+          <w:ilvl w:val="0"/>
+          <w:numId w:val="23"/>
+        </w:numPr>
+        <w:rPr>
+          <w:lang w:val="en-IN"/>
+        </w:rPr>
+      </w:pPr>
+      <w:r>
+        <w:rPr>
+          <w:lang w:val="en-IN"/>
+        </w:rPr>
+        <w:t xml:space="preserve">Explore follow-up questions </w:t>
+      </w:r>
+    </w:p>
+    <w:p>
+      <w:pPr>
+        <w:pStyle w:val="BodyText"/>
+        <w:numPr>
+          <w:ilvl w:val="0"/>
+          <w:numId w:val="23"/>
+        </w:numPr>
+        <w:rPr>
+          <w:lang w:val="en-IN"/>
+        </w:rPr>
+      </w:pPr>
+      <w:r>
+        <w:rPr>
+          <w:lang w:val="en-IN"/>
+        </w:rPr>
+        <w:t>Review historical analysis responses</w:t>
+      </w:r>
+    </w:p>
+    <w:p>
+      <w:pPr>
+        <w:pStyle w:val="BodyText"/>
+      </w:pPr>
+    </w:p>
+    <w:p>
+      <w:pPr>
+        <w:pStyle w:val="BodyText"/>
+      </w:pPr>
+      <w:r>
+        <w:rPr>
+          <w:noProof/>
+        </w:rPr>
+        <w:drawing>
+          <wp:inline distT="0" distB="0" distL="0" distR="0" wp14:anchorId="793A120B" wp14:editId="691CAC51">
+            <wp:extent cx="5943600" cy="3665855"/>
+            <wp:effectExtent l="0" t="0" r="0" b="0"/>
+            <wp:docPr id="857847398" name="Picture 2"/>
+            <wp:cNvGraphicFramePr>
+              <a:graphicFrameLocks xmlns:a="http://schemas.openxmlformats.org/drawingml/2006/main" noChangeAspect="1"/>
+            </wp:cNvGraphicFramePr>
+            <a:graphic xmlns:a="http://schemas.openxmlformats.org/drawingml/2006/main">
+              <a:graphicData uri="http://schemas.openxmlformats.org/drawingml/2006/picture">
+                <pic:pic xmlns:pic="http://schemas.openxmlformats.org/drawingml/2006/picture">
+                  <pic:nvPicPr>
+                    <pic:cNvPr id="857847398" name="Picture 857847398"/>
+                    <pic:cNvPicPr/>
+                  </pic:nvPicPr>
+                  <pic:blipFill>
+                    <a:blip r:embed="rId5">
+                      <a:extLst>
+                        <a:ext uri="{28A0092B-C50C-407E-A947-70E740481C1C}">
+                          <a14:useLocalDpi xmlns:a14="http://schemas.microsoft.com/office/drawing/2010/main" val="0"/>
+                        </a:ext>
+                      </a:extLst>
+                    </a:blip>
+                    <a:stretch>
+                      <a:fillRect/>
+                    </a:stretch>
+                  </pic:blipFill>
+                  <pic:spPr>
+                    <a:xfrm>
+                      <a:off x="0" y="0"/>
+                      <a:ext cx="5943600" cy="3665855"/>
+                    </a:xfrm>
+                    <a:prstGeom prst="rect">
+                      <a:avLst/>
+                    </a:prstGeom>
+                  </pic:spPr>
+                </pic:pic>
+              </a:graphicData>
+            </a:graphic>
+          </wp:inline>
+        </w:drawing>
+      </w:r>
+    </w:p>
+    <w:p>
+      <w:pPr>
+        <w:pStyle w:val="BodyText"/>
+      </w:pPr>
+    </w:p>
+    <w:p>
+      <w:pPr>
+        <w:pStyle w:val="BodyText"/>
+      </w:pPr>
+    </w:p>
+    <w:p>
+      <w:pPr>
+        <w:pStyle w:val="BodyText"/>
+      </w:pPr>
+    </w:p>
+    <w:p>
+      <w:pPr>
+        <w:pStyle w:val="Heading1"/>
+      </w:pPr>
+      <w:r>
+        <w:lastRenderedPageBreak/>
         <w:t>OpenAI Integration</w:t>
       </w:r>
     </w:p>
@@ -3748,7 +3953,7 @@
     <w:p>
       <w:r>
         <w:pict w14:anchorId="7C94F0D9">
-          <v:rect id="_x0000_i1051" style="width:0;height:1.5pt" o:hralign="center" o:hrstd="t" o:hr="t"/>
+          <v:rect id="_x0000_i1052" style="width:0;height:1.5pt" o:hralign="center" o:hrstd="t" o:hr="t"/>
         </w:pict>
       </w:r>
     </w:p>
@@ -3932,7 +4137,7 @@
     <w:p>
       <w:r>
         <w:pict w14:anchorId="78E8A898">
-          <v:rect id="_x0000_i1052" style="width:0;height:1.5pt" o:hralign="center" o:hrstd="t" o:hr="t"/>
+          <v:rect id="_x0000_i1053" style="width:0;height:1.5pt" o:hralign="center" o:hrstd="t" o:hr="t"/>
         </w:pict>
       </w:r>
     </w:p>
@@ -3995,7 +4200,7 @@
     <w:p>
       <w:r>
         <w:pict w14:anchorId="1098C17D">
-          <v:rect id="_x0000_i1053" style="width:0;height:1.5pt" o:hralign="center" o:hrstd="t" o:hr="t"/>
+          <v:rect id="_x0000_i1054" style="width:0;height:1.5pt" o:hralign="center" o:hrstd="t" o:hr="t"/>
         </w:pict>
       </w:r>
     </w:p>
@@ -4024,6 +4229,11 @@
       <v:rect id="_x0000_i1025" style="width:0;height:1.5pt" o:hralign="center" o:bullet="t" o:hrstd="t" o:hr="t"/>
     </w:pict>
   </w:numPicBullet>
+  <w:numPicBullet w:numPicBulletId="1">
+    <w:pict>
+      <v:rect id="_x0000_i1026" style="width:0;height:1.5pt" o:hralign="center" o:bullet="t" o:hrstd="t" o:hr="t"/>
+    </w:pict>
+  </w:numPicBullet>
   <w:abstractNum w:abstractNumId="0" w15:restartNumberingAfterBreak="0">
     <w:nsid w:val="0000A990"/>
     <w:multiLevelType w:val="multilevel"/>
@@ -5100,6 +5310,155 @@
     </w:lvl>
   </w:abstractNum>
   <w:abstractNum w:abstractNumId="8" w15:restartNumberingAfterBreak="0">
+    <w:nsid w:val="5CE2122D"/>
+    <w:multiLevelType w:val="multilevel"/>
+    <w:tmpl w:val="E110BE8E"/>
+    <w:lvl w:ilvl="0">
+      <w:start w:val="1"/>
+      <w:numFmt w:val="bullet"/>
+      <w:lvlText w:val=""/>
+      <w:lvlJc w:val="left"/>
+      <w:pPr>
+        <w:tabs>
+          <w:tab w:val="num" w:pos="720"/>
+        </w:tabs>
+        <w:ind w:left="720" w:hanging="360"/>
+      </w:pPr>
+      <w:rPr>
+        <w:rFonts w:ascii="Symbol" w:hAnsi="Symbol" w:hint="default"/>
+        <w:sz w:val="20"/>
+      </w:rPr>
+    </w:lvl>
+    <w:lvl w:ilvl="1" w:tentative="1">
+      <w:start w:val="1"/>
+      <w:numFmt w:val="bullet"/>
+      <w:lvlText w:val="o"/>
+      <w:lvlJc w:val="left"/>
+      <w:pPr>
+        <w:tabs>
+          <w:tab w:val="num" w:pos="1440"/>
+        </w:tabs>
+        <w:ind w:left="1440" w:hanging="360"/>
+      </w:pPr>
+      <w:rPr>
+        <w:rFonts w:ascii="Courier New" w:hAnsi="Courier New" w:hint="default"/>
+        <w:sz w:val="20"/>
+      </w:rPr>
+    </w:lvl>
+    <w:lvl w:ilvl="2" w:tentative="1">
+      <w:start w:val="1"/>
+      <w:numFmt w:val="bullet"/>
+      <w:lvlText w:val=""/>
+      <w:lvlJc w:val="left"/>
+      <w:pPr>
+        <w:tabs>
+          <w:tab w:val="num" w:pos="2160"/>
+        </w:tabs>
+        <w:ind w:left="2160" w:hanging="360"/>
+      </w:pPr>
+      <w:rPr>
+        <w:rFonts w:ascii="Wingdings" w:hAnsi="Wingdings" w:hint="default"/>
+        <w:sz w:val="20"/>
+      </w:rPr>
+    </w:lvl>
+    <w:lvl w:ilvl="3" w:tentative="1">
+      <w:start w:val="1"/>
+      <w:numFmt w:val="bullet"/>
+      <w:lvlText w:val=""/>
+      <w:lvlJc w:val="left"/>
+      <w:pPr>
+        <w:tabs>
+          <w:tab w:val="num" w:pos="2880"/>
+        </w:tabs>
+        <w:ind w:left="2880" w:hanging="360"/>
+      </w:pPr>
+      <w:rPr>
+        <w:rFonts w:ascii="Wingdings" w:hAnsi="Wingdings" w:hint="default"/>
+        <w:sz w:val="20"/>
+      </w:rPr>
+    </w:lvl>
+    <w:lvl w:ilvl="4" w:tentative="1">
+      <w:start w:val="1"/>
+      <w:numFmt w:val="bullet"/>
+      <w:lvlText w:val=""/>
+      <w:lvlJc w:val="left"/>
+      <w:pPr>
+        <w:tabs>
+          <w:tab w:val="num" w:pos="3600"/>
+        </w:tabs>
+        <w:ind w:left="3600" w:hanging="360"/>
+      </w:pPr>
+      <w:rPr>
+        <w:rFonts w:ascii="Wingdings" w:hAnsi="Wingdings" w:hint="default"/>
+        <w:sz w:val="20"/>
+      </w:rPr>
+    </w:lvl>
+    <w:lvl w:ilvl="5" w:tentative="1">
+      <w:start w:val="1"/>
+      <w:numFmt w:val="bullet"/>
+      <w:lvlText w:val=""/>
+      <w:lvlJc w:val="left"/>
+      <w:pPr>
+        <w:tabs>
+          <w:tab w:val="num" w:pos="4320"/>
+        </w:tabs>
+        <w:ind w:left="4320" w:hanging="360"/>
+      </w:pPr>
+      <w:rPr>
+        <w:rFonts w:ascii="Wingdings" w:hAnsi="Wingdings" w:hint="default"/>
+        <w:sz w:val="20"/>
+      </w:rPr>
+    </w:lvl>
+    <w:lvl w:ilvl="6" w:tentative="1">
+      <w:start w:val="1"/>
+      <w:numFmt w:val="bullet"/>
+      <w:lvlText w:val=""/>
+      <w:lvlJc w:val="left"/>
+      <w:pPr>
+        <w:tabs>
+          <w:tab w:val="num" w:pos="5040"/>
+        </w:tabs>
+        <w:ind w:left="5040" w:hanging="360"/>
+      </w:pPr>
+      <w:rPr>
+        <w:rFonts w:ascii="Wingdings" w:hAnsi="Wingdings" w:hint="default"/>
+        <w:sz w:val="20"/>
+      </w:rPr>
+    </w:lvl>
+    <w:lvl w:ilvl="7" w:tentative="1">
+      <w:start w:val="1"/>
+      <w:numFmt w:val="bullet"/>
+      <w:lvlText w:val=""/>
+      <w:lvlJc w:val="left"/>
+      <w:pPr>
+        <w:tabs>
+          <w:tab w:val="num" w:pos="5760"/>
+        </w:tabs>
+        <w:ind w:left="5760" w:hanging="360"/>
+      </w:pPr>
+      <w:rPr>
+        <w:rFonts w:ascii="Wingdings" w:hAnsi="Wingdings" w:hint="default"/>
+        <w:sz w:val="20"/>
+      </w:rPr>
+    </w:lvl>
+    <w:lvl w:ilvl="8" w:tentative="1">
+      <w:start w:val="1"/>
+      <w:numFmt w:val="bullet"/>
+      <w:lvlText w:val=""/>
+      <w:lvlJc w:val="left"/>
+      <w:pPr>
+        <w:tabs>
+          <w:tab w:val="num" w:pos="6480"/>
+        </w:tabs>
+        <w:ind w:left="6480" w:hanging="360"/>
+      </w:pPr>
+      <w:rPr>
+        <w:rFonts w:ascii="Wingdings" w:hAnsi="Wingdings" w:hint="default"/>
+        <w:sz w:val="20"/>
+      </w:rPr>
+    </w:lvl>
+  </w:abstractNum>
+  <w:abstractNum w:abstractNumId="9" w15:restartNumberingAfterBreak="0">
     <w:nsid w:val="615A7D8D"/>
     <w:multiLevelType w:val="multilevel"/>
     <w:tmpl w:val="B566938C"/>
@@ -5248,7 +5607,7 @@
       </w:rPr>
     </w:lvl>
   </w:abstractNum>
-  <w:abstractNum w:abstractNumId="9" w15:restartNumberingAfterBreak="0">
+  <w:abstractNum w:abstractNumId="10" w15:restartNumberingAfterBreak="0">
     <w:nsid w:val="77072C7B"/>
     <w:multiLevelType w:val="hybridMultilevel"/>
     <w:tmpl w:val="94445D3E"/>
@@ -5404,7 +5763,7 @@
     <w:abstractNumId w:val="1"/>
   </w:num>
   <w:num w:numId="15" w16cid:durableId="1949896184">
-    <w:abstractNumId w:val="8"/>
+    <w:abstractNumId w:val="9"/>
   </w:num>
   <w:num w:numId="16" w16cid:durableId="928349373">
     <w:abstractNumId w:val="3"/>
@@ -5422,10 +5781,13 @@
     <w:abstractNumId w:val="4"/>
   </w:num>
   <w:num w:numId="21" w16cid:durableId="293676267">
-    <w:abstractNumId w:val="9"/>
+    <w:abstractNumId w:val="10"/>
   </w:num>
   <w:num w:numId="22" w16cid:durableId="1164473027">
     <w:abstractNumId w:val="6"/>
+  </w:num>
+  <w:num w:numId="23" w16cid:durableId="1606689128">
+    <w:abstractNumId w:val="8"/>
   </w:num>
 </w:numbering>
 </file>
@@ -5897,6 +6259,7 @@
   <w:style w:type="character" w:default="1" w:styleId="DefaultParagraphFont">
     <w:name w:val="Default Paragraph Font"/>
     <w:uiPriority w:val="1"/>
+    <w:semiHidden/>
     <w:unhideWhenUsed/>
   </w:style>
   <w:style w:type="table" w:default="1" w:styleId="TableNormal">

</xml_diff>